<commit_message>
Document d'analyse final oublié commit
</commit_message>
<xml_diff>
--- a/Mandat 1 - Planification/Document d'analyse.docx
+++ b/Mandat 1 - Planification/Document d'analyse.docx
@@ -38,6 +38,7 @@
         </w:rPr>
         <w:t xml:space="preserve">La compagnie </w:t>
       </w:r>
+      <w:proofErr w:type="spellStart"/>
       <w:r>
         <w:rPr>
           <w:sz w:val="24"/>
@@ -50,7 +51,15 @@
           <w:sz w:val="24"/>
           <w:szCs w:val="24"/>
         </w:rPr>
-        <w:t>elleVibe est un fournisseur de services de télécommunications, offrant les</w:t>
+        <w:t>elleVibe</w:t>
+      </w:r>
+      <w:proofErr w:type="spellEnd"/>
+      <w:r>
+        <w:rPr>
+          <w:sz w:val="24"/>
+          <w:szCs w:val="24"/>
+        </w:rPr>
+        <w:t xml:space="preserve"> est un fournisseur de services de télécommunications, offrant les</w:t>
       </w:r>
       <w:r>
         <w:rPr>
@@ -962,7 +971,15 @@
           <w:sz w:val="24"/>
           <w:szCs w:val="24"/>
         </w:rPr>
-        <w:t>L’application est utilisée uniquement par le personnel interne de Belle</w:t>
+        <w:t xml:space="preserve">L’application est utilisée uniquement par le personnel interne de </w:t>
+      </w:r>
+      <w:proofErr w:type="spellStart"/>
+      <w:r>
+        <w:rPr>
+          <w:sz w:val="24"/>
+          <w:szCs w:val="24"/>
+        </w:rPr>
+        <w:t>Belle</w:t>
       </w:r>
       <w:r>
         <w:rPr>
@@ -978,6 +995,7 @@
         </w:rPr>
         <w:t>e</w:t>
       </w:r>
+      <w:proofErr w:type="spellEnd"/>
     </w:p>
     <w:p>
       <w:pPr>
@@ -1148,6 +1166,1120 @@
           <w:szCs w:val="24"/>
         </w:rPr>
         <w:t>L’application est développée dans un cadre académique</w:t>
+      </w:r>
+    </w:p>
+    <w:p>
+      <w:pPr>
+        <w:rPr>
+          <w:sz w:val="24"/>
+          <w:szCs w:val="24"/>
+        </w:rPr>
+      </w:pPr>
+    </w:p>
+    <w:p>
+      <w:pPr>
+        <w:rPr>
+          <w:sz w:val="24"/>
+          <w:szCs w:val="24"/>
+        </w:rPr>
+      </w:pPr>
+    </w:p>
+    <w:p>
+      <w:pPr>
+        <w:rPr>
+          <w:sz w:val="24"/>
+          <w:szCs w:val="24"/>
+        </w:rPr>
+      </w:pPr>
+    </w:p>
+    <w:p>
+      <w:pPr>
+        <w:rPr>
+          <w:sz w:val="24"/>
+          <w:szCs w:val="24"/>
+        </w:rPr>
+      </w:pPr>
+    </w:p>
+    <w:p>
+      <w:pPr>
+        <w:rPr>
+          <w:sz w:val="24"/>
+          <w:szCs w:val="24"/>
+        </w:rPr>
+      </w:pPr>
+    </w:p>
+    <w:p>
+      <w:pPr>
+        <w:rPr>
+          <w:sz w:val="24"/>
+          <w:szCs w:val="24"/>
+        </w:rPr>
+      </w:pPr>
+      <w:r>
+        <w:rPr>
+          <w:sz w:val="24"/>
+          <w:szCs w:val="24"/>
+        </w:rPr>
+        <w:lastRenderedPageBreak/>
+        <w:t>Diagramme de cas d’utilisation</w:t>
+      </w:r>
+      <w:r>
+        <w:rPr>
+          <w:sz w:val="24"/>
+          <w:szCs w:val="24"/>
+        </w:rPr>
+        <w:t xml:space="preserve"> : </w:t>
+      </w:r>
+    </w:p>
+    <w:p>
+      <w:pPr>
+        <w:rPr>
+          <w:sz w:val="24"/>
+          <w:szCs w:val="24"/>
+        </w:rPr>
+      </w:pPr>
+      <w:r>
+        <w:rPr>
+          <w:sz w:val="24"/>
+          <w:szCs w:val="24"/>
+        </w:rPr>
+        <w:drawing>
+          <wp:inline distT="0" distB="0" distL="0" distR="0" wp14:anchorId="42B4A693" wp14:editId="2171561F">
+            <wp:extent cx="5943600" cy="5509260"/>
+            <wp:effectExtent l="0" t="0" r="0" b="0"/>
+            <wp:docPr id="1776161636" name="Image 1" descr="Une image contenant texte, capture d’écran, diagramme, astronomie&#10;&#10;Le contenu généré par l’IA peut être incorrect."/>
+            <wp:cNvGraphicFramePr>
+              <a:graphicFrameLocks xmlns:a="http://schemas.openxmlformats.org/drawingml/2006/main" noChangeAspect="1"/>
+            </wp:cNvGraphicFramePr>
+            <a:graphic xmlns:a="http://schemas.openxmlformats.org/drawingml/2006/main">
+              <a:graphicData uri="http://schemas.openxmlformats.org/drawingml/2006/picture">
+                <pic:pic xmlns:pic="http://schemas.openxmlformats.org/drawingml/2006/picture">
+                  <pic:nvPicPr>
+                    <pic:cNvPr id="1776161636" name="Image 1" descr="Une image contenant texte, capture d’écran, diagramme, astronomie&#10;&#10;Le contenu généré par l’IA peut être incorrect."/>
+                    <pic:cNvPicPr/>
+                  </pic:nvPicPr>
+                  <pic:blipFill>
+                    <a:blip r:embed="rId7"/>
+                    <a:stretch>
+                      <a:fillRect/>
+                    </a:stretch>
+                  </pic:blipFill>
+                  <pic:spPr>
+                    <a:xfrm>
+                      <a:off x="0" y="0"/>
+                      <a:ext cx="5943600" cy="5509260"/>
+                    </a:xfrm>
+                    <a:prstGeom prst="rect">
+                      <a:avLst/>
+                    </a:prstGeom>
+                  </pic:spPr>
+                </pic:pic>
+              </a:graphicData>
+            </a:graphic>
+          </wp:inline>
+        </w:drawing>
+      </w:r>
+    </w:p>
+    <w:p>
+      <w:pPr>
+        <w:rPr>
+          <w:sz w:val="24"/>
+          <w:szCs w:val="24"/>
+        </w:rPr>
+      </w:pPr>
+    </w:p>
+    <w:p>
+      <w:pPr>
+        <w:rPr>
+          <w:sz w:val="24"/>
+          <w:szCs w:val="24"/>
+        </w:rPr>
+      </w:pPr>
+    </w:p>
+    <w:p>
+      <w:pPr>
+        <w:rPr>
+          <w:sz w:val="24"/>
+          <w:szCs w:val="24"/>
+        </w:rPr>
+      </w:pPr>
+    </w:p>
+    <w:p>
+      <w:pPr>
+        <w:rPr>
+          <w:sz w:val="24"/>
+          <w:szCs w:val="24"/>
+        </w:rPr>
+      </w:pPr>
+    </w:p>
+    <w:p>
+      <w:pPr>
+        <w:rPr>
+          <w:sz w:val="24"/>
+          <w:szCs w:val="24"/>
+        </w:rPr>
+      </w:pPr>
+    </w:p>
+    <w:p>
+      <w:pPr>
+        <w:rPr>
+          <w:sz w:val="24"/>
+          <w:szCs w:val="24"/>
+        </w:rPr>
+      </w:pPr>
+    </w:p>
+    <w:p>
+      <w:pPr>
+        <w:rPr>
+          <w:sz w:val="24"/>
+          <w:szCs w:val="24"/>
+        </w:rPr>
+      </w:pPr>
+    </w:p>
+    <w:p>
+      <w:pPr>
+        <w:rPr>
+          <w:sz w:val="24"/>
+          <w:szCs w:val="24"/>
+        </w:rPr>
+      </w:pPr>
+      <w:r>
+        <w:rPr>
+          <w:sz w:val="24"/>
+          <w:szCs w:val="24"/>
+        </w:rPr>
+        <w:lastRenderedPageBreak/>
+        <w:t xml:space="preserve">Matrice de </w:t>
+      </w:r>
+      <w:r>
+        <w:rPr>
+          <w:sz w:val="24"/>
+          <w:szCs w:val="24"/>
+        </w:rPr>
+        <w:t xml:space="preserve">permissions : </w:t>
+      </w:r>
+    </w:p>
+    <w:p>
+      <w:pPr>
+        <w:rPr>
+          <w:sz w:val="24"/>
+          <w:szCs w:val="24"/>
+        </w:rPr>
+      </w:pPr>
+      <w:r>
+        <w:rPr>
+          <w:sz w:val="24"/>
+          <w:szCs w:val="24"/>
+        </w:rPr>
+        <w:drawing>
+          <wp:inline distT="0" distB="0" distL="0" distR="0" wp14:anchorId="5E4AEF47" wp14:editId="6C4B5A85">
+            <wp:extent cx="5943600" cy="7560945"/>
+            <wp:effectExtent l="0" t="0" r="0" b="1905"/>
+            <wp:docPr id="938405936" name="Image 1" descr="Une image contenant texte, nombre, Parallèle, Police&#10;&#10;Le contenu généré par l’IA peut être incorrect."/>
+            <wp:cNvGraphicFramePr>
+              <a:graphicFrameLocks xmlns:a="http://schemas.openxmlformats.org/drawingml/2006/main" noChangeAspect="1"/>
+            </wp:cNvGraphicFramePr>
+            <a:graphic xmlns:a="http://schemas.openxmlformats.org/drawingml/2006/main">
+              <a:graphicData uri="http://schemas.openxmlformats.org/drawingml/2006/picture">
+                <pic:pic xmlns:pic="http://schemas.openxmlformats.org/drawingml/2006/picture">
+                  <pic:nvPicPr>
+                    <pic:cNvPr id="938405936" name="Image 1" descr="Une image contenant texte, nombre, Parallèle, Police&#10;&#10;Le contenu généré par l’IA peut être incorrect."/>
+                    <pic:cNvPicPr/>
+                  </pic:nvPicPr>
+                  <pic:blipFill>
+                    <a:blip r:embed="rId8"/>
+                    <a:stretch>
+                      <a:fillRect/>
+                    </a:stretch>
+                  </pic:blipFill>
+                  <pic:spPr>
+                    <a:xfrm>
+                      <a:off x="0" y="0"/>
+                      <a:ext cx="5943600" cy="7560945"/>
+                    </a:xfrm>
+                    <a:prstGeom prst="rect">
+                      <a:avLst/>
+                    </a:prstGeom>
+                  </pic:spPr>
+                </pic:pic>
+              </a:graphicData>
+            </a:graphic>
+          </wp:inline>
+        </w:drawing>
+      </w:r>
+    </w:p>
+    <w:p>
+      <w:pPr>
+        <w:rPr>
+          <w:sz w:val="24"/>
+          <w:szCs w:val="24"/>
+        </w:rPr>
+      </w:pPr>
+      <w:r>
+        <w:rPr>
+          <w:sz w:val="24"/>
+          <w:szCs w:val="24"/>
+        </w:rPr>
+        <w:lastRenderedPageBreak/>
+        <w:drawing>
+          <wp:inline distT="0" distB="0" distL="0" distR="0" wp14:anchorId="413307A0" wp14:editId="23AB9C8B">
+            <wp:extent cx="5943600" cy="6059170"/>
+            <wp:effectExtent l="0" t="0" r="0" b="0"/>
+            <wp:docPr id="965993981" name="Image 1" descr="Une image contenant texte, capture d’écran, nombre, Parallèle&#10;&#10;Le contenu généré par l’IA peut être incorrect."/>
+            <wp:cNvGraphicFramePr>
+              <a:graphicFrameLocks xmlns:a="http://schemas.openxmlformats.org/drawingml/2006/main" noChangeAspect="1"/>
+            </wp:cNvGraphicFramePr>
+            <a:graphic xmlns:a="http://schemas.openxmlformats.org/drawingml/2006/main">
+              <a:graphicData uri="http://schemas.openxmlformats.org/drawingml/2006/picture">
+                <pic:pic xmlns:pic="http://schemas.openxmlformats.org/drawingml/2006/picture">
+                  <pic:nvPicPr>
+                    <pic:cNvPr id="965993981" name="Image 1" descr="Une image contenant texte, capture d’écran, nombre, Parallèle&#10;&#10;Le contenu généré par l’IA peut être incorrect."/>
+                    <pic:cNvPicPr/>
+                  </pic:nvPicPr>
+                  <pic:blipFill>
+                    <a:blip r:embed="rId9"/>
+                    <a:stretch>
+                      <a:fillRect/>
+                    </a:stretch>
+                  </pic:blipFill>
+                  <pic:spPr>
+                    <a:xfrm>
+                      <a:off x="0" y="0"/>
+                      <a:ext cx="5943600" cy="6059170"/>
+                    </a:xfrm>
+                    <a:prstGeom prst="rect">
+                      <a:avLst/>
+                    </a:prstGeom>
+                  </pic:spPr>
+                </pic:pic>
+              </a:graphicData>
+            </a:graphic>
+          </wp:inline>
+        </w:drawing>
+      </w:r>
+    </w:p>
+    <w:p>
+      <w:pPr>
+        <w:rPr>
+          <w:sz w:val="24"/>
+          <w:szCs w:val="24"/>
+        </w:rPr>
+      </w:pPr>
+      <w:r>
+        <w:rPr>
+          <w:sz w:val="24"/>
+          <w:szCs w:val="24"/>
+        </w:rPr>
+        <w:br w:type="page"/>
+      </w:r>
+    </w:p>
+    <w:p>
+      <w:pPr>
+        <w:rPr>
+          <w:sz w:val="24"/>
+          <w:szCs w:val="24"/>
+        </w:rPr>
+      </w:pPr>
+      <w:r>
+        <w:rPr>
+          <w:sz w:val="24"/>
+          <w:szCs w:val="24"/>
+        </w:rPr>
+        <w:lastRenderedPageBreak/>
+        <w:t xml:space="preserve">Diagramme de Modèle relationnel : </w:t>
+      </w:r>
+    </w:p>
+    <w:p>
+      <w:pPr>
+        <w:rPr>
+          <w:sz w:val="24"/>
+          <w:szCs w:val="24"/>
+        </w:rPr>
+      </w:pPr>
+      <w:r>
+        <w:rPr>
+          <w:sz w:val="24"/>
+          <w:szCs w:val="24"/>
+        </w:rPr>
+        <w:drawing>
+          <wp:inline distT="0" distB="0" distL="0" distR="0" wp14:anchorId="25AC2E24" wp14:editId="70C55BE6">
+            <wp:extent cx="5943600" cy="4064000"/>
+            <wp:effectExtent l="0" t="0" r="0" b="0"/>
+            <wp:docPr id="394047848" name="Image 1" descr="Une image contenant texte, capture d’écran, diagramme, ligne&#10;&#10;Le contenu généré par l’IA peut être incorrect."/>
+            <wp:cNvGraphicFramePr>
+              <a:graphicFrameLocks xmlns:a="http://schemas.openxmlformats.org/drawingml/2006/main" noChangeAspect="1"/>
+            </wp:cNvGraphicFramePr>
+            <a:graphic xmlns:a="http://schemas.openxmlformats.org/drawingml/2006/main">
+              <a:graphicData uri="http://schemas.openxmlformats.org/drawingml/2006/picture">
+                <pic:pic xmlns:pic="http://schemas.openxmlformats.org/drawingml/2006/picture">
+                  <pic:nvPicPr>
+                    <pic:cNvPr id="394047848" name="Image 1" descr="Une image contenant texte, capture d’écran, diagramme, ligne&#10;&#10;Le contenu généré par l’IA peut être incorrect."/>
+                    <pic:cNvPicPr/>
+                  </pic:nvPicPr>
+                  <pic:blipFill>
+                    <a:blip r:embed="rId10"/>
+                    <a:stretch>
+                      <a:fillRect/>
+                    </a:stretch>
+                  </pic:blipFill>
+                  <pic:spPr>
+                    <a:xfrm>
+                      <a:off x="0" y="0"/>
+                      <a:ext cx="5943600" cy="4064000"/>
+                    </a:xfrm>
+                    <a:prstGeom prst="rect">
+                      <a:avLst/>
+                    </a:prstGeom>
+                  </pic:spPr>
+                </pic:pic>
+              </a:graphicData>
+            </a:graphic>
+          </wp:inline>
+        </w:drawing>
+      </w:r>
+    </w:p>
+    <w:p>
+      <w:pPr>
+        <w:rPr>
+          <w:sz w:val="24"/>
+          <w:szCs w:val="24"/>
+        </w:rPr>
+      </w:pPr>
+      <w:r>
+        <w:rPr>
+          <w:sz w:val="24"/>
+          <w:szCs w:val="24"/>
+        </w:rPr>
+        <w:t>Diagramme Entité-Relations</w:t>
+      </w:r>
+    </w:p>
+    <w:p>
+      <w:pPr>
+        <w:rPr>
+          <w:sz w:val="24"/>
+          <w:szCs w:val="24"/>
+        </w:rPr>
+      </w:pPr>
+      <w:r>
+        <w:rPr>
+          <w:sz w:val="24"/>
+          <w:szCs w:val="24"/>
+        </w:rPr>
+        <w:drawing>
+          <wp:inline distT="0" distB="0" distL="0" distR="0" wp14:anchorId="2C48997D" wp14:editId="4AE88FC8">
+            <wp:extent cx="5943600" cy="3307080"/>
+            <wp:effectExtent l="0" t="0" r="0" b="7620"/>
+            <wp:docPr id="1383194923" name="Image 1" descr="Une image contenant capture d’écran, diagramme, texte&#10;&#10;Le contenu généré par l’IA peut être incorrect."/>
+            <wp:cNvGraphicFramePr>
+              <a:graphicFrameLocks xmlns:a="http://schemas.openxmlformats.org/drawingml/2006/main" noChangeAspect="1"/>
+            </wp:cNvGraphicFramePr>
+            <a:graphic xmlns:a="http://schemas.openxmlformats.org/drawingml/2006/main">
+              <a:graphicData uri="http://schemas.openxmlformats.org/drawingml/2006/picture">
+                <pic:pic xmlns:pic="http://schemas.openxmlformats.org/drawingml/2006/picture">
+                  <pic:nvPicPr>
+                    <pic:cNvPr id="1383194923" name="Image 1" descr="Une image contenant capture d’écran, diagramme, texte&#10;&#10;Le contenu généré par l’IA peut être incorrect."/>
+                    <pic:cNvPicPr/>
+                  </pic:nvPicPr>
+                  <pic:blipFill>
+                    <a:blip r:embed="rId11"/>
+                    <a:stretch>
+                      <a:fillRect/>
+                    </a:stretch>
+                  </pic:blipFill>
+                  <pic:spPr>
+                    <a:xfrm>
+                      <a:off x="0" y="0"/>
+                      <a:ext cx="5943600" cy="3307080"/>
+                    </a:xfrm>
+                    <a:prstGeom prst="rect">
+                      <a:avLst/>
+                    </a:prstGeom>
+                  </pic:spPr>
+                </pic:pic>
+              </a:graphicData>
+            </a:graphic>
+          </wp:inline>
+        </w:drawing>
+      </w:r>
+    </w:p>
+    <w:p>
+      <w:pPr>
+        <w:rPr>
+          <w:sz w:val="24"/>
+          <w:szCs w:val="24"/>
+        </w:rPr>
+      </w:pPr>
+      <w:r>
+        <w:rPr>
+          <w:sz w:val="24"/>
+          <w:szCs w:val="24"/>
+        </w:rPr>
+        <w:br w:type="page"/>
+      </w:r>
+      <w:r>
+        <w:rPr>
+          <w:sz w:val="24"/>
+          <w:szCs w:val="24"/>
+        </w:rPr>
+        <w:lastRenderedPageBreak/>
+        <w:drawing>
+          <wp:anchor distT="0" distB="0" distL="114300" distR="114300" simplePos="0" relativeHeight="251665408" behindDoc="0" locked="0" layoutInCell="1" allowOverlap="1" wp14:anchorId="652EFB47" wp14:editId="1E346BA3">
+            <wp:simplePos x="0" y="0"/>
+            <wp:positionH relativeFrom="margin">
+              <wp:align>left</wp:align>
+            </wp:positionH>
+            <wp:positionV relativeFrom="paragraph">
+              <wp:posOffset>5583354</wp:posOffset>
+            </wp:positionV>
+            <wp:extent cx="2962275" cy="2104390"/>
+            <wp:effectExtent l="0" t="0" r="9525" b="0"/>
+            <wp:wrapTopAndBottom/>
+            <wp:docPr id="591083861" name="Image 1" descr="Une image contenant texte, capture d’écran, nombre, Police&#10;&#10;Le contenu généré par l’IA peut être incorrect."/>
+            <wp:cNvGraphicFramePr>
+              <a:graphicFrameLocks xmlns:a="http://schemas.openxmlformats.org/drawingml/2006/main" noChangeAspect="1"/>
+            </wp:cNvGraphicFramePr>
+            <a:graphic xmlns:a="http://schemas.openxmlformats.org/drawingml/2006/main">
+              <a:graphicData uri="http://schemas.openxmlformats.org/drawingml/2006/picture">
+                <pic:pic xmlns:pic="http://schemas.openxmlformats.org/drawingml/2006/picture">
+                  <pic:nvPicPr>
+                    <pic:cNvPr id="591083861" name="Image 1" descr="Une image contenant texte, capture d’écran, nombre, Police&#10;&#10;Le contenu généré par l’IA peut être incorrect."/>
+                    <pic:cNvPicPr/>
+                  </pic:nvPicPr>
+                  <pic:blipFill>
+                    <a:blip r:embed="rId12" cstate="print">
+                      <a:extLst>
+                        <a:ext uri="{28A0092B-C50C-407E-A947-70E740481C1C}">
+                          <a14:useLocalDpi xmlns:a14="http://schemas.microsoft.com/office/drawing/2010/main" val="0"/>
+                        </a:ext>
+                      </a:extLst>
+                    </a:blip>
+                    <a:stretch>
+                      <a:fillRect/>
+                    </a:stretch>
+                  </pic:blipFill>
+                  <pic:spPr>
+                    <a:xfrm>
+                      <a:off x="0" y="0"/>
+                      <a:ext cx="2962275" cy="2104390"/>
+                    </a:xfrm>
+                    <a:prstGeom prst="rect">
+                      <a:avLst/>
+                    </a:prstGeom>
+                  </pic:spPr>
+                </pic:pic>
+              </a:graphicData>
+            </a:graphic>
+            <wp14:sizeRelH relativeFrom="margin">
+              <wp14:pctWidth>0</wp14:pctWidth>
+            </wp14:sizeRelH>
+            <wp14:sizeRelV relativeFrom="margin">
+              <wp14:pctHeight>0</wp14:pctHeight>
+            </wp14:sizeRelV>
+          </wp:anchor>
+        </w:drawing>
+      </w:r>
+      <w:r>
+        <w:rPr>
+          <w:sz w:val="24"/>
+          <w:szCs w:val="24"/>
+        </w:rPr>
+        <w:drawing>
+          <wp:anchor distT="0" distB="0" distL="114300" distR="114300" simplePos="0" relativeHeight="251664384" behindDoc="0" locked="0" layoutInCell="1" allowOverlap="1" wp14:anchorId="522903A7" wp14:editId="77B1253F">
+            <wp:simplePos x="0" y="0"/>
+            <wp:positionH relativeFrom="margin">
+              <wp:posOffset>2978150</wp:posOffset>
+            </wp:positionH>
+            <wp:positionV relativeFrom="paragraph">
+              <wp:posOffset>5725160</wp:posOffset>
+            </wp:positionV>
+            <wp:extent cx="2940050" cy="1750695"/>
+            <wp:effectExtent l="0" t="0" r="0" b="1905"/>
+            <wp:wrapTopAndBottom/>
+            <wp:docPr id="1448461634" name="Image 1" descr="Une image contenant texte, capture d’écran, nombre, Police&#10;&#10;Le contenu généré par l’IA peut être incorrect."/>
+            <wp:cNvGraphicFramePr>
+              <a:graphicFrameLocks xmlns:a="http://schemas.openxmlformats.org/drawingml/2006/main" noChangeAspect="1"/>
+            </wp:cNvGraphicFramePr>
+            <a:graphic xmlns:a="http://schemas.openxmlformats.org/drawingml/2006/main">
+              <a:graphicData uri="http://schemas.openxmlformats.org/drawingml/2006/picture">
+                <pic:pic xmlns:pic="http://schemas.openxmlformats.org/drawingml/2006/picture">
+                  <pic:nvPicPr>
+                    <pic:cNvPr id="1448461634" name="Image 1" descr="Une image contenant texte, capture d’écran, nombre, Police&#10;&#10;Le contenu généré par l’IA peut être incorrect."/>
+                    <pic:cNvPicPr/>
+                  </pic:nvPicPr>
+                  <pic:blipFill>
+                    <a:blip r:embed="rId13" cstate="print">
+                      <a:extLst>
+                        <a:ext uri="{28A0092B-C50C-407E-A947-70E740481C1C}">
+                          <a14:useLocalDpi xmlns:a14="http://schemas.microsoft.com/office/drawing/2010/main" val="0"/>
+                        </a:ext>
+                      </a:extLst>
+                    </a:blip>
+                    <a:stretch>
+                      <a:fillRect/>
+                    </a:stretch>
+                  </pic:blipFill>
+                  <pic:spPr>
+                    <a:xfrm>
+                      <a:off x="0" y="0"/>
+                      <a:ext cx="2940050" cy="1750695"/>
+                    </a:xfrm>
+                    <a:prstGeom prst="rect">
+                      <a:avLst/>
+                    </a:prstGeom>
+                  </pic:spPr>
+                </pic:pic>
+              </a:graphicData>
+            </a:graphic>
+          </wp:anchor>
+        </w:drawing>
+      </w:r>
+      <w:r>
+        <w:rPr>
+          <w:sz w:val="24"/>
+          <w:szCs w:val="24"/>
+        </w:rPr>
+        <w:drawing>
+          <wp:anchor distT="0" distB="0" distL="114300" distR="114300" simplePos="0" relativeHeight="251663360" behindDoc="0" locked="0" layoutInCell="1" allowOverlap="1" wp14:anchorId="41AE6FF7" wp14:editId="05057F6D">
+            <wp:simplePos x="0" y="0"/>
+            <wp:positionH relativeFrom="margin">
+              <wp:align>right</wp:align>
+            </wp:positionH>
+            <wp:positionV relativeFrom="paragraph">
+              <wp:posOffset>3947210</wp:posOffset>
+            </wp:positionV>
+            <wp:extent cx="2962931" cy="1746420"/>
+            <wp:effectExtent l="0" t="0" r="8890" b="6350"/>
+            <wp:wrapTopAndBottom/>
+            <wp:docPr id="1373752877" name="Image 1" descr="Une image contenant texte, capture d’écran, Police, nombre&#10;&#10;Le contenu généré par l’IA peut être incorrect."/>
+            <wp:cNvGraphicFramePr>
+              <a:graphicFrameLocks xmlns:a="http://schemas.openxmlformats.org/drawingml/2006/main" noChangeAspect="1"/>
+            </wp:cNvGraphicFramePr>
+            <a:graphic xmlns:a="http://schemas.openxmlformats.org/drawingml/2006/main">
+              <a:graphicData uri="http://schemas.openxmlformats.org/drawingml/2006/picture">
+                <pic:pic xmlns:pic="http://schemas.openxmlformats.org/drawingml/2006/picture">
+                  <pic:nvPicPr>
+                    <pic:cNvPr id="1373752877" name="Image 1" descr="Une image contenant texte, capture d’écran, Police, nombre&#10;&#10;Le contenu généré par l’IA peut être incorrect."/>
+                    <pic:cNvPicPr/>
+                  </pic:nvPicPr>
+                  <pic:blipFill>
+                    <a:blip r:embed="rId14" cstate="print">
+                      <a:extLst>
+                        <a:ext uri="{28A0092B-C50C-407E-A947-70E740481C1C}">
+                          <a14:useLocalDpi xmlns:a14="http://schemas.microsoft.com/office/drawing/2010/main" val="0"/>
+                        </a:ext>
+                      </a:extLst>
+                    </a:blip>
+                    <a:stretch>
+                      <a:fillRect/>
+                    </a:stretch>
+                  </pic:blipFill>
+                  <pic:spPr>
+                    <a:xfrm>
+                      <a:off x="0" y="0"/>
+                      <a:ext cx="2962931" cy="1746420"/>
+                    </a:xfrm>
+                    <a:prstGeom prst="rect">
+                      <a:avLst/>
+                    </a:prstGeom>
+                  </pic:spPr>
+                </pic:pic>
+              </a:graphicData>
+            </a:graphic>
+          </wp:anchor>
+        </w:drawing>
+      </w:r>
+      <w:r>
+        <w:rPr>
+          <w:sz w:val="24"/>
+          <w:szCs w:val="24"/>
+        </w:rPr>
+        <w:drawing>
+          <wp:anchor distT="0" distB="0" distL="114300" distR="114300" simplePos="0" relativeHeight="251662336" behindDoc="0" locked="0" layoutInCell="1" allowOverlap="1" wp14:anchorId="46543F97" wp14:editId="33824BF8">
+            <wp:simplePos x="0" y="0"/>
+            <wp:positionH relativeFrom="margin">
+              <wp:align>left</wp:align>
+            </wp:positionH>
+            <wp:positionV relativeFrom="paragraph">
+              <wp:posOffset>3960495</wp:posOffset>
+            </wp:positionV>
+            <wp:extent cx="2950845" cy="1567815"/>
+            <wp:effectExtent l="0" t="0" r="1905" b="0"/>
+            <wp:wrapTopAndBottom/>
+            <wp:docPr id="1006901235" name="Image 1" descr="Une image contenant texte, capture d’écran, Police, nombre&#10;&#10;Le contenu généré par l’IA peut être incorrect."/>
+            <wp:cNvGraphicFramePr>
+              <a:graphicFrameLocks xmlns:a="http://schemas.openxmlformats.org/drawingml/2006/main" noChangeAspect="1"/>
+            </wp:cNvGraphicFramePr>
+            <a:graphic xmlns:a="http://schemas.openxmlformats.org/drawingml/2006/main">
+              <a:graphicData uri="http://schemas.openxmlformats.org/drawingml/2006/picture">
+                <pic:pic xmlns:pic="http://schemas.openxmlformats.org/drawingml/2006/picture">
+                  <pic:nvPicPr>
+                    <pic:cNvPr id="1006901235" name="Image 1" descr="Une image contenant texte, capture d’écran, Police, nombre&#10;&#10;Le contenu généré par l’IA peut être incorrect."/>
+                    <pic:cNvPicPr/>
+                  </pic:nvPicPr>
+                  <pic:blipFill>
+                    <a:blip r:embed="rId15" cstate="print">
+                      <a:extLst>
+                        <a:ext uri="{28A0092B-C50C-407E-A947-70E740481C1C}">
+                          <a14:useLocalDpi xmlns:a14="http://schemas.microsoft.com/office/drawing/2010/main" val="0"/>
+                        </a:ext>
+                      </a:extLst>
+                    </a:blip>
+                    <a:stretch>
+                      <a:fillRect/>
+                    </a:stretch>
+                  </pic:blipFill>
+                  <pic:spPr>
+                    <a:xfrm>
+                      <a:off x="0" y="0"/>
+                      <a:ext cx="2958369" cy="1571512"/>
+                    </a:xfrm>
+                    <a:prstGeom prst="rect">
+                      <a:avLst/>
+                    </a:prstGeom>
+                  </pic:spPr>
+                </pic:pic>
+              </a:graphicData>
+            </a:graphic>
+            <wp14:sizeRelH relativeFrom="margin">
+              <wp14:pctWidth>0</wp14:pctWidth>
+            </wp14:sizeRelH>
+            <wp14:sizeRelV relativeFrom="margin">
+              <wp14:pctHeight>0</wp14:pctHeight>
+            </wp14:sizeRelV>
+          </wp:anchor>
+        </w:drawing>
+      </w:r>
+      <w:r>
+        <w:rPr>
+          <w:sz w:val="24"/>
+          <w:szCs w:val="24"/>
+        </w:rPr>
+        <w:drawing>
+          <wp:anchor distT="0" distB="0" distL="114300" distR="114300" simplePos="0" relativeHeight="251661312" behindDoc="0" locked="0" layoutInCell="1" allowOverlap="1" wp14:anchorId="2859A101" wp14:editId="358E0B48">
+            <wp:simplePos x="0" y="0"/>
+            <wp:positionH relativeFrom="margin">
+              <wp:align>right</wp:align>
+            </wp:positionH>
+            <wp:positionV relativeFrom="paragraph">
+              <wp:posOffset>2324898</wp:posOffset>
+            </wp:positionV>
+            <wp:extent cx="2969260" cy="1592580"/>
+            <wp:effectExtent l="0" t="0" r="2540" b="7620"/>
+            <wp:wrapTopAndBottom/>
+            <wp:docPr id="1733349705" name="Image 1" descr="Une image contenant texte, capture d’écran, logiciel, Icône d’ordinateur&#10;&#10;Le contenu généré par l’IA peut être incorrect."/>
+            <wp:cNvGraphicFramePr>
+              <a:graphicFrameLocks xmlns:a="http://schemas.openxmlformats.org/drawingml/2006/main" noChangeAspect="1"/>
+            </wp:cNvGraphicFramePr>
+            <a:graphic xmlns:a="http://schemas.openxmlformats.org/drawingml/2006/main">
+              <a:graphicData uri="http://schemas.openxmlformats.org/drawingml/2006/picture">
+                <pic:pic xmlns:pic="http://schemas.openxmlformats.org/drawingml/2006/picture">
+                  <pic:nvPicPr>
+                    <pic:cNvPr id="1733349705" name="Image 1" descr="Une image contenant texte, capture d’écran, logiciel, Icône d’ordinateur&#10;&#10;Le contenu généré par l’IA peut être incorrect."/>
+                    <pic:cNvPicPr/>
+                  </pic:nvPicPr>
+                  <pic:blipFill>
+                    <a:blip r:embed="rId16">
+                      <a:extLst>
+                        <a:ext uri="{28A0092B-C50C-407E-A947-70E740481C1C}">
+                          <a14:useLocalDpi xmlns:a14="http://schemas.microsoft.com/office/drawing/2010/main" val="0"/>
+                        </a:ext>
+                      </a:extLst>
+                    </a:blip>
+                    <a:stretch>
+                      <a:fillRect/>
+                    </a:stretch>
+                  </pic:blipFill>
+                  <pic:spPr>
+                    <a:xfrm>
+                      <a:off x="0" y="0"/>
+                      <a:ext cx="2969260" cy="1592580"/>
+                    </a:xfrm>
+                    <a:prstGeom prst="rect">
+                      <a:avLst/>
+                    </a:prstGeom>
+                  </pic:spPr>
+                </pic:pic>
+              </a:graphicData>
+            </a:graphic>
+            <wp14:sizeRelH relativeFrom="margin">
+              <wp14:pctWidth>0</wp14:pctWidth>
+            </wp14:sizeRelH>
+            <wp14:sizeRelV relativeFrom="margin">
+              <wp14:pctHeight>0</wp14:pctHeight>
+            </wp14:sizeRelV>
+          </wp:anchor>
+        </w:drawing>
+      </w:r>
+      <w:r>
+        <w:rPr>
+          <w:sz w:val="24"/>
+          <w:szCs w:val="24"/>
+        </w:rPr>
+        <w:drawing>
+          <wp:anchor distT="0" distB="0" distL="114300" distR="114300" simplePos="0" relativeHeight="251660288" behindDoc="0" locked="0" layoutInCell="1" allowOverlap="1" wp14:anchorId="009F48AA" wp14:editId="3E33B081">
+            <wp:simplePos x="0" y="0"/>
+            <wp:positionH relativeFrom="margin">
+              <wp:align>left</wp:align>
+            </wp:positionH>
+            <wp:positionV relativeFrom="paragraph">
+              <wp:posOffset>2361565</wp:posOffset>
+            </wp:positionV>
+            <wp:extent cx="2928620" cy="1555750"/>
+            <wp:effectExtent l="0" t="0" r="5080" b="6350"/>
+            <wp:wrapTopAndBottom/>
+            <wp:docPr id="1626538029" name="Image 1" descr="Une image contenant texte, capture d’écran, logiciel&#10;&#10;Le contenu généré par l’IA peut être incorrect."/>
+            <wp:cNvGraphicFramePr>
+              <a:graphicFrameLocks xmlns:a="http://schemas.openxmlformats.org/drawingml/2006/main" noChangeAspect="1"/>
+            </wp:cNvGraphicFramePr>
+            <a:graphic xmlns:a="http://schemas.openxmlformats.org/drawingml/2006/main">
+              <a:graphicData uri="http://schemas.openxmlformats.org/drawingml/2006/picture">
+                <pic:pic xmlns:pic="http://schemas.openxmlformats.org/drawingml/2006/picture">
+                  <pic:nvPicPr>
+                    <pic:cNvPr id="1626538029" name="Image 1" descr="Une image contenant texte, capture d’écran, logiciel&#10;&#10;Le contenu généré par l’IA peut être incorrect."/>
+                    <pic:cNvPicPr/>
+                  </pic:nvPicPr>
+                  <pic:blipFill>
+                    <a:blip r:embed="rId17">
+                      <a:extLst>
+                        <a:ext uri="{28A0092B-C50C-407E-A947-70E740481C1C}">
+                          <a14:useLocalDpi xmlns:a14="http://schemas.microsoft.com/office/drawing/2010/main" val="0"/>
+                        </a:ext>
+                      </a:extLst>
+                    </a:blip>
+                    <a:stretch>
+                      <a:fillRect/>
+                    </a:stretch>
+                  </pic:blipFill>
+                  <pic:spPr>
+                    <a:xfrm>
+                      <a:off x="0" y="0"/>
+                      <a:ext cx="2928620" cy="1555750"/>
+                    </a:xfrm>
+                    <a:prstGeom prst="rect">
+                      <a:avLst/>
+                    </a:prstGeom>
+                  </pic:spPr>
+                </pic:pic>
+              </a:graphicData>
+            </a:graphic>
+            <wp14:sizeRelH relativeFrom="margin">
+              <wp14:pctWidth>0</wp14:pctWidth>
+            </wp14:sizeRelH>
+            <wp14:sizeRelV relativeFrom="margin">
+              <wp14:pctHeight>0</wp14:pctHeight>
+            </wp14:sizeRelV>
+          </wp:anchor>
+        </w:drawing>
+      </w:r>
+      <w:r>
+        <w:rPr>
+          <w:sz w:val="24"/>
+          <w:szCs w:val="24"/>
+        </w:rPr>
+        <w:drawing>
+          <wp:anchor distT="0" distB="0" distL="114300" distR="114300" simplePos="0" relativeHeight="251658240" behindDoc="0" locked="0" layoutInCell="1" allowOverlap="1" wp14:anchorId="1DA035B8" wp14:editId="46E9133C">
+            <wp:simplePos x="0" y="0"/>
+            <wp:positionH relativeFrom="margin">
+              <wp:align>right</wp:align>
+            </wp:positionH>
+            <wp:positionV relativeFrom="paragraph">
+              <wp:posOffset>241935</wp:posOffset>
+            </wp:positionV>
+            <wp:extent cx="2990850" cy="1927860"/>
+            <wp:effectExtent l="0" t="0" r="0" b="0"/>
+            <wp:wrapTopAndBottom/>
+            <wp:docPr id="1216718648" name="Image 1" descr="Une image contenant texte, capture d’écran, nombre&#10;&#10;Le contenu généré par l’IA peut être incorrect."/>
+            <wp:cNvGraphicFramePr>
+              <a:graphicFrameLocks xmlns:a="http://schemas.openxmlformats.org/drawingml/2006/main" noChangeAspect="1"/>
+            </wp:cNvGraphicFramePr>
+            <a:graphic xmlns:a="http://schemas.openxmlformats.org/drawingml/2006/main">
+              <a:graphicData uri="http://schemas.openxmlformats.org/drawingml/2006/picture">
+                <pic:pic xmlns:pic="http://schemas.openxmlformats.org/drawingml/2006/picture">
+                  <pic:nvPicPr>
+                    <pic:cNvPr id="1216718648" name="Image 1" descr="Une image contenant texte, capture d’écran, nombre&#10;&#10;Le contenu généré par l’IA peut être incorrect."/>
+                    <pic:cNvPicPr/>
+                  </pic:nvPicPr>
+                  <pic:blipFill>
+                    <a:blip r:embed="rId18">
+                      <a:extLst>
+                        <a:ext uri="{28A0092B-C50C-407E-A947-70E740481C1C}">
+                          <a14:useLocalDpi xmlns:a14="http://schemas.microsoft.com/office/drawing/2010/main" val="0"/>
+                        </a:ext>
+                      </a:extLst>
+                    </a:blip>
+                    <a:stretch>
+                      <a:fillRect/>
+                    </a:stretch>
+                  </pic:blipFill>
+                  <pic:spPr>
+                    <a:xfrm>
+                      <a:off x="0" y="0"/>
+                      <a:ext cx="2990850" cy="1927860"/>
+                    </a:xfrm>
+                    <a:prstGeom prst="rect">
+                      <a:avLst/>
+                    </a:prstGeom>
+                  </pic:spPr>
+                </pic:pic>
+              </a:graphicData>
+            </a:graphic>
+          </wp:anchor>
+        </w:drawing>
+      </w:r>
+      <w:r>
+        <w:rPr>
+          <w:sz w:val="24"/>
+          <w:szCs w:val="24"/>
+        </w:rPr>
+        <w:drawing>
+          <wp:anchor distT="0" distB="0" distL="114300" distR="114300" simplePos="0" relativeHeight="251659264" behindDoc="0" locked="0" layoutInCell="1" allowOverlap="1" wp14:anchorId="12E6F02C" wp14:editId="13A88C71">
+            <wp:simplePos x="0" y="0"/>
+            <wp:positionH relativeFrom="margin">
+              <wp:align>left</wp:align>
+            </wp:positionH>
+            <wp:positionV relativeFrom="paragraph">
+              <wp:posOffset>233504</wp:posOffset>
+            </wp:positionV>
+            <wp:extent cx="2950845" cy="2086610"/>
+            <wp:effectExtent l="0" t="0" r="1905" b="8890"/>
+            <wp:wrapTopAndBottom/>
+            <wp:docPr id="1182553022" name="Image 1" descr="Une image contenant texte, capture d’écran, logiciel, nombre&#10;&#10;Le contenu généré par l’IA peut être incorrect."/>
+            <wp:cNvGraphicFramePr>
+              <a:graphicFrameLocks xmlns:a="http://schemas.openxmlformats.org/drawingml/2006/main" noChangeAspect="1"/>
+            </wp:cNvGraphicFramePr>
+            <a:graphic xmlns:a="http://schemas.openxmlformats.org/drawingml/2006/main">
+              <a:graphicData uri="http://schemas.openxmlformats.org/drawingml/2006/picture">
+                <pic:pic xmlns:pic="http://schemas.openxmlformats.org/drawingml/2006/picture">
+                  <pic:nvPicPr>
+                    <pic:cNvPr id="1182553022" name="Image 1" descr="Une image contenant texte, capture d’écran, logiciel, nombre&#10;&#10;Le contenu généré par l’IA peut être incorrect."/>
+                    <pic:cNvPicPr/>
+                  </pic:nvPicPr>
+                  <pic:blipFill>
+                    <a:blip r:embed="rId19">
+                      <a:extLst>
+                        <a:ext uri="{28A0092B-C50C-407E-A947-70E740481C1C}">
+                          <a14:useLocalDpi xmlns:a14="http://schemas.microsoft.com/office/drawing/2010/main" val="0"/>
+                        </a:ext>
+                      </a:extLst>
+                    </a:blip>
+                    <a:stretch>
+                      <a:fillRect/>
+                    </a:stretch>
+                  </pic:blipFill>
+                  <pic:spPr>
+                    <a:xfrm>
+                      <a:off x="0" y="0"/>
+                      <a:ext cx="2950845" cy="2086610"/>
+                    </a:xfrm>
+                    <a:prstGeom prst="rect">
+                      <a:avLst/>
+                    </a:prstGeom>
+                  </pic:spPr>
+                </pic:pic>
+              </a:graphicData>
+            </a:graphic>
+          </wp:anchor>
+        </w:drawing>
+      </w:r>
+      <w:r>
+        <w:rPr>
+          <w:sz w:val="24"/>
+          <w:szCs w:val="24"/>
+        </w:rPr>
+        <w:t xml:space="preserve">Dictionnaire des données : </w:t>
+      </w:r>
+    </w:p>
+    <w:p>
+      <w:pPr>
+        <w:rPr>
+          <w:sz w:val="24"/>
+          <w:szCs w:val="24"/>
+        </w:rPr>
+      </w:pPr>
+      <w:r>
+        <w:rPr>
+          <w:sz w:val="24"/>
+          <w:szCs w:val="24"/>
+        </w:rPr>
+        <w:lastRenderedPageBreak/>
+        <w:drawing>
+          <wp:anchor distT="0" distB="0" distL="114300" distR="114300" simplePos="0" relativeHeight="251667456" behindDoc="0" locked="0" layoutInCell="1" allowOverlap="1" wp14:anchorId="342A1D5E" wp14:editId="62F2E4DD">
+            <wp:simplePos x="0" y="0"/>
+            <wp:positionH relativeFrom="margin">
+              <wp:align>right</wp:align>
+            </wp:positionH>
+            <wp:positionV relativeFrom="paragraph">
+              <wp:posOffset>2761</wp:posOffset>
+            </wp:positionV>
+            <wp:extent cx="2985135" cy="1421130"/>
+            <wp:effectExtent l="0" t="0" r="5715" b="7620"/>
+            <wp:wrapTopAndBottom/>
+            <wp:docPr id="1234297866" name="Image 1" descr="Une image contenant texte, capture d’écran, Police, nombre&#10;&#10;Le contenu généré par l’IA peut être incorrect."/>
+            <wp:cNvGraphicFramePr>
+              <a:graphicFrameLocks xmlns:a="http://schemas.openxmlformats.org/drawingml/2006/main" noChangeAspect="1"/>
+            </wp:cNvGraphicFramePr>
+            <a:graphic xmlns:a="http://schemas.openxmlformats.org/drawingml/2006/main">
+              <a:graphicData uri="http://schemas.openxmlformats.org/drawingml/2006/picture">
+                <pic:pic xmlns:pic="http://schemas.openxmlformats.org/drawingml/2006/picture">
+                  <pic:nvPicPr>
+                    <pic:cNvPr id="1234297866" name="Image 1" descr="Une image contenant texte, capture d’écran, Police, nombre&#10;&#10;Le contenu généré par l’IA peut être incorrect."/>
+                    <pic:cNvPicPr/>
+                  </pic:nvPicPr>
+                  <pic:blipFill>
+                    <a:blip r:embed="rId20" cstate="print">
+                      <a:extLst>
+                        <a:ext uri="{28A0092B-C50C-407E-A947-70E740481C1C}">
+                          <a14:useLocalDpi xmlns:a14="http://schemas.microsoft.com/office/drawing/2010/main" val="0"/>
+                        </a:ext>
+                      </a:extLst>
+                    </a:blip>
+                    <a:stretch>
+                      <a:fillRect/>
+                    </a:stretch>
+                  </pic:blipFill>
+                  <pic:spPr>
+                    <a:xfrm>
+                      <a:off x="0" y="0"/>
+                      <a:ext cx="2985135" cy="1421130"/>
+                    </a:xfrm>
+                    <a:prstGeom prst="rect">
+                      <a:avLst/>
+                    </a:prstGeom>
+                  </pic:spPr>
+                </pic:pic>
+              </a:graphicData>
+            </a:graphic>
+            <wp14:sizeRelH relativeFrom="margin">
+              <wp14:pctWidth>0</wp14:pctWidth>
+            </wp14:sizeRelH>
+            <wp14:sizeRelV relativeFrom="margin">
+              <wp14:pctHeight>0</wp14:pctHeight>
+            </wp14:sizeRelV>
+          </wp:anchor>
+        </w:drawing>
+      </w:r>
+      <w:r>
+        <w:rPr>
+          <w:sz w:val="24"/>
+          <w:szCs w:val="24"/>
+        </w:rPr>
+        <w:drawing>
+          <wp:inline distT="0" distB="0" distL="0" distR="0" wp14:anchorId="350E2252" wp14:editId="02B51182">
+            <wp:extent cx="2901636" cy="795780"/>
+            <wp:effectExtent l="0" t="0" r="0" b="4445"/>
+            <wp:docPr id="1938307299" name="Image 1" descr="Une image contenant texte, capture d’écran, Police, ligne&#10;&#10;Le contenu généré par l’IA peut être incorrect."/>
+            <wp:cNvGraphicFramePr>
+              <a:graphicFrameLocks xmlns:a="http://schemas.openxmlformats.org/drawingml/2006/main" noChangeAspect="1"/>
+            </wp:cNvGraphicFramePr>
+            <a:graphic xmlns:a="http://schemas.openxmlformats.org/drawingml/2006/main">
+              <a:graphicData uri="http://schemas.openxmlformats.org/drawingml/2006/picture">
+                <pic:pic xmlns:pic="http://schemas.openxmlformats.org/drawingml/2006/picture">
+                  <pic:nvPicPr>
+                    <pic:cNvPr id="1938307299" name="Image 1" descr="Une image contenant texte, capture d’écran, Police, ligne&#10;&#10;Le contenu généré par l’IA peut être incorrect."/>
+                    <pic:cNvPicPr/>
+                  </pic:nvPicPr>
+                  <pic:blipFill>
+                    <a:blip r:embed="rId21"/>
+                    <a:stretch>
+                      <a:fillRect/>
+                    </a:stretch>
+                  </pic:blipFill>
+                  <pic:spPr>
+                    <a:xfrm>
+                      <a:off x="0" y="0"/>
+                      <a:ext cx="2901636" cy="795780"/>
+                    </a:xfrm>
+                    <a:prstGeom prst="rect">
+                      <a:avLst/>
+                    </a:prstGeom>
+                  </pic:spPr>
+                </pic:pic>
+              </a:graphicData>
+            </a:graphic>
+          </wp:inline>
+        </w:drawing>
+      </w:r>
+      <w:r>
+        <w:rPr>
+          <w:sz w:val="24"/>
+          <w:szCs w:val="24"/>
+        </w:rPr>
+        <w:br/>
+      </w:r>
+      <w:r>
+        <w:rPr>
+          <w:sz w:val="24"/>
+          <w:szCs w:val="24"/>
+        </w:rPr>
+        <w:br/>
+      </w:r>
+      <w:r>
+        <w:rPr>
+          <w:sz w:val="24"/>
+          <w:szCs w:val="24"/>
+        </w:rPr>
+        <w:br/>
+      </w:r>
+      <w:r>
+        <w:rPr>
+          <w:sz w:val="24"/>
+          <w:szCs w:val="24"/>
+        </w:rPr>
+        <w:drawing>
+          <wp:anchor distT="0" distB="0" distL="114300" distR="114300" simplePos="0" relativeHeight="251666432" behindDoc="0" locked="0" layoutInCell="1" allowOverlap="1" wp14:anchorId="4A7F9A7D" wp14:editId="748AFA4C">
+            <wp:simplePos x="0" y="0"/>
+            <wp:positionH relativeFrom="margin">
+              <wp:posOffset>-73025</wp:posOffset>
+            </wp:positionH>
+            <wp:positionV relativeFrom="paragraph">
+              <wp:posOffset>0</wp:posOffset>
+            </wp:positionV>
+            <wp:extent cx="2985770" cy="1421130"/>
+            <wp:effectExtent l="0" t="0" r="5080" b="7620"/>
+            <wp:wrapTopAndBottom/>
+            <wp:docPr id="60079300" name="Image 1" descr="Une image contenant texte, capture d’écran, Police, nombre&#10;&#10;Le contenu généré par l’IA peut être incorrect."/>
+            <wp:cNvGraphicFramePr>
+              <a:graphicFrameLocks xmlns:a="http://schemas.openxmlformats.org/drawingml/2006/main" noChangeAspect="1"/>
+            </wp:cNvGraphicFramePr>
+            <a:graphic xmlns:a="http://schemas.openxmlformats.org/drawingml/2006/main">
+              <a:graphicData uri="http://schemas.openxmlformats.org/drawingml/2006/picture">
+                <pic:pic xmlns:pic="http://schemas.openxmlformats.org/drawingml/2006/picture">
+                  <pic:nvPicPr>
+                    <pic:cNvPr id="60079300" name="Image 1" descr="Une image contenant texte, capture d’écran, Police, nombre&#10;&#10;Le contenu généré par l’IA peut être incorrect."/>
+                    <pic:cNvPicPr/>
+                  </pic:nvPicPr>
+                  <pic:blipFill>
+                    <a:blip r:embed="rId22" cstate="print">
+                      <a:extLst>
+                        <a:ext uri="{28A0092B-C50C-407E-A947-70E740481C1C}">
+                          <a14:useLocalDpi xmlns:a14="http://schemas.microsoft.com/office/drawing/2010/main" val="0"/>
+                        </a:ext>
+                      </a:extLst>
+                    </a:blip>
+                    <a:stretch>
+                      <a:fillRect/>
+                    </a:stretch>
+                  </pic:blipFill>
+                  <pic:spPr>
+                    <a:xfrm>
+                      <a:off x="0" y="0"/>
+                      <a:ext cx="2985770" cy="1421130"/>
+                    </a:xfrm>
+                    <a:prstGeom prst="rect">
+                      <a:avLst/>
+                    </a:prstGeom>
+                  </pic:spPr>
+                </pic:pic>
+              </a:graphicData>
+            </a:graphic>
+            <wp14:sizeRelH relativeFrom="margin">
+              <wp14:pctWidth>0</wp14:pctWidth>
+            </wp14:sizeRelH>
+            <wp14:sizeRelV relativeFrom="margin">
+              <wp14:pctHeight>0</wp14:pctHeight>
+            </wp14:sizeRelV>
+          </wp:anchor>
+        </w:drawing>
       </w:r>
     </w:p>
     <w:sectPr>
@@ -2629,7 +3761,6 @@
   <w:style w:type="character" w:default="1" w:styleId="Policepardfaut">
     <w:name w:val="Default Paragraph Font"/>
     <w:uiPriority w:val="1"/>
-    <w:semiHidden/>
     <w:unhideWhenUsed/>
   </w:style>
   <w:style w:type="table" w:default="1" w:styleId="TableauNormal">

</xml_diff>